<commit_message>
fix(catalog): limit stem lengths to 70cm, update copy to direct harvest sales, and remove per-stem prices
</commit_message>
<xml_diff>
--- a/contrato/Contrato_Landing_Page_Jossy_Roses.docx
+++ b/contrato/Contrato_Landing_Page_Jossy_Roses.docx
@@ -974,7 +974,7 @@
                               <w:sz w:val="20"/>
                               <w:szCs w:val="20"/>
                             </w:rPr>
-                            <w:t>https://kindevx.web.app/</w:t>
+                            <w:t>https://www.kindevsas.com/</w:t>
                           </w:r>
                         </w:p>
                       </w:txbxContent>
@@ -1010,7 +1010,7 @@
                         <w:sz w:val="20"/>
                         <w:szCs w:val="20"/>
                       </w:rPr>
-                      <w:t>https://kindevx.web.app/</w:t>
+                      <w:t>https://www.kindevsas.com/</w:t>
                     </w:r>
                   </w:p>
                 </w:txbxContent>

</xml_diff>